<commit_message>
Add QUIC statistical evidence and manuscript updates
</commit_message>
<xml_diff>
--- a/paper/submission/ReduLink_journal_ready_v3_8.docx
+++ b/paper/submission/ReduLink_journal_ready_v3_8.docx
@@ -323,7 +323,7 @@
         <w:rPr>
           <w:sz w:val="20"/>
         </w:rPr>
-        <w:t>ReduLink differs in three ways that matter for the deployments it targets. First, it authenticates each reference individually and binds it to epoch, scope, stream, reconstructed offset, length, and a nonce, so a reference cannot be replayed across context or silently expanded; compression-dictionary schemes treat the dictionary as a codec input and rely on the surrounding TLS channel for integrity. Second, ReduLink defines an explicit fail-closed semantic-repair path (MISS then FULL) rather than degrading to a codec fallback. Third, it is a general stream-representation abstraction rather than a codec scoped to HTTP responses with URL-pattern dictionary matching. We therefore treat compression dictionary transport as the strongest deployed point of comparison and position ReduLink as the authenticated, fail-closed, transport-general variant of the same receiver-side reuse idea; Section 12 and Table 24 consolidate this comparison. The distinction is not merely cosmetic: consider a shared or partially trusted origin dictionary, where a CDN edge or several tenants serve from one warm dictionary. An unauthenticated codec reference cannot distinguish a legitimate cross-version reference from a forged or cross-context one, whereas ReduLink's per-reference binding to epoch, scope, stream, offset, and nonce makes such a reference fail closed. That shared-dictionary integrity case, not raw compression ratio, is the gap ReduLink targets.</w:t>
+        <w:t>ReduLink differs in three ways that matter for the deployments it targets. First, it authenticates each reference individually and binds it to epoch, scope, stream, reconstructed offset, length, and a nonce, so a reference cannot be replayed across context or silently expanded; compression-dictionary schemes treat the dictionary as a codec input and rely on the surrounding TLS channel for integrity. Second, ReduLink defines an explicit fail-closed semantic-repair path (MISS then FULL) rather than degrading to a codec fallback. Third, it is a general stream-representation abstraction rather than a codec scoped to HTTP responses with URL-pattern dictionary matching. We therefore treat compression dictionary transport as the strongest deployed point of comparison and position ReduLink as the authenticated, fail-closed, transport-general variant of the same receiver-side reuse idea; Section 12 and Table 25 consolidate this comparison. The distinction is not merely cosmetic: consider a shared or partially trusted origin dictionary, where a CDN edge or several tenants serve from one warm dictionary. An unauthenticated codec reference cannot distinguish a legitimate cross-version reference from a forged or cross-context one, whereas ReduLink's per-reference binding to epoch, scope, stream, offset, and nonce makes such a reference fail closed. That shared-dictionary integrity case, not raw compression ratio, is the gap ReduLink targets.</w:t>
       </w:r>
     </w:p>
     <w:p>
@@ -14692,7 +14692,7 @@
         <w:rPr>
           <w:sz w:val="20"/>
         </w:rPr>
-        <w:t>Table 19 reports a measured concurrent competing-flow experiment in which a raw QUIC flow and a ReduLink flow (both using aioquic's default NewReno congestion controller, so fairness is between identical stacks) run simultaneously over a shared localhost schedule with periodic datagram loss, repeated over 12 rounds. Across the measured rounds the reconstructed-rate Jain index [25] is 0.923 and the encoded-rate index is 0.722 (for two concurrent flows Jain's index ranges from 0.5 to 1.0), with every flow reconstructing correctly; the lower encoded-rate index is expected, reflecting that ReduLink transmits far fewer encoded bytes than the raw flow rather than transport-level unfairness. This is a real loopback measurement without rate shaping; Table 20 adds measured rate and delay emulation, and Table 21 varies the semantic miss rate on one constrained point. Table 22 is an analytic illustration rather than a measurement: it applies a closed-form fluid model - fair-share serialization of the measured encoded bytes plus one RTT of completion latency - to the measured encoded byte counts. Because ReduLink encodes fewer bytes, the model yields a lower completion time and therefore a higher implied application rate at the same encoded fair share; for example at 25 Mbps and 10 ms the model gives 29.7 ms versus 51.3 ms for raw. This advantage is arithmetic, a direct consequence of sending fewer encoded bytes; the measured emulation of Table 20 shows why it is optimistic, since the fluid model ignores queueing delay and ReduLink's application-level repair round trips, which in measurement reverse the completion-time ordering at 5 Mbps. We retain the model only as a best-case bound on the byte-volume effect.</w:t>
+        <w:t>Table 19 reports a measured concurrent competing-flow experiment in which a raw QUIC flow and a ReduLink flow (both using aioquic's default NewReno congestion controller, so fairness is between identical stacks) run simultaneously over a shared localhost schedule with periodic datagram loss, repeated over 12 rounds. Across the measured rounds the reconstructed-rate Jain index [25] is 0.923 and the encoded-rate index is 0.722 (for two concurrent flows Jain's index ranges from 0.5 to 1.0), with every flow reconstructing correctly; the lower encoded-rate index is expected, reflecting that ReduLink transmits far fewer encoded bytes than the raw flow rather than transport-level unfairness. This is a real loopback measurement without rate shaping; Table 20 adds measured rate and delay emulation, Table 21 varies the semantic miss rate on one constrained point, and Table 22 reports bootstrap confidence intervals for the repeated QUIC measurements. Table 23 is an analytic illustration rather than a measurement: it applies a closed-form fluid model - fair-share serialization of the measured encoded bytes plus one RTT of completion latency - to the measured encoded byte counts. Because ReduLink encodes fewer bytes, the model yields a lower completion time and therefore a higher implied application rate at the same encoded fair share; for example at 25 Mbps and 10 ms the model gives 29.7 ms versus 51.3 ms for raw. This advantage is arithmetic, a direct consequence of sending fewer encoded bytes; the measured emulation of Table 20 shows why it is optimistic, since the fluid model ignores queueing delay and ReduLink's application-level repair round trips, which in measurement reverse the completion-time ordering at 5 Mbps. We retain the model only as a best-case bound on the byte-volume effect.</w:t>
       </w:r>
     </w:p>
     <w:p>
@@ -18007,6 +18007,22 @@
     </w:tbl>
     <w:p/>
     <w:p>
+      <w:r>
+        <w:br w:type="page"/>
+      </w:r>
+    </w:p>
+    <w:p>
+      <w:pPr>
+        <w:spacing w:after="80" w:before="0"/>
+      </w:pPr>
+      <w:r>
+        <w:rPr>
+          <w:sz w:val="20"/>
+        </w:rPr>
+        <w:t>Table 22 adds uncertainty estimates to the repeated QUIC measurements rather than relying only on point estimates. The intervals are deterministic percentile bootstrap confidence intervals over paired raw/ReduLink rows where available. They strengthen the interpretation of Table 20: the demo constrained path has a clear byte and completion-time advantage, while the Redis constrained path has a stable encoded-byte reduction but a wide completion-time interval because semantic MISS/FULL repair round trips dominate some runs. A macOS pf/dnctl kernel-path harness was added to the artifact and its dry-run rules are tested, but the live aioquic sweep is not claimed here: on this development Mac, raw aioquic handshakes intermittently timed out under loopback dummynet even after port-specific rules and cleanup, so kernel tc/netem or Mininet validation remains future work.</w:t>
+      </w:r>
+    </w:p>
+    <w:p>
       <w:pPr>
         <w:spacing w:after="40" w:before="120"/>
       </w:pPr>
@@ -18015,7 +18031,1051 @@
           <w:b/>
           <w:sz w:val="18"/>
         </w:rPr>
-        <w:t>Table 22. Analytic fluid-model completion times and implied application rates from measured encoded stream bytes (raw versus ReduLink); computed, not measured.</w:t>
+        <w:t>Table 22. Statistical uncertainty for repeated native QUIC measurements (deterministic bootstrap 95% confidence intervals).</w:t>
+      </w:r>
+    </w:p>
+    <w:tbl>
+      <w:tblPr>
+        <w:tblStyle w:val="TableGrid"/>
+        <w:tblW w:type="auto" w:w="0"/>
+        <w:jc w:val="center"/>
+        <w:tblLook w:firstColumn="1" w:firstRow="1" w:lastColumn="0" w:lastRow="0" w:noHBand="0" w:noVBand="1" w:val="04A0"/>
+      </w:tblPr>
+      <w:tblGrid>
+        <w:gridCol w:w="2102"/>
+        <w:gridCol w:w="2102"/>
+        <w:gridCol w:w="2102"/>
+        <w:gridCol w:w="2102"/>
+        <w:gridCol w:w="2102"/>
+      </w:tblGrid>
+      <w:tr>
+        <w:tc>
+          <w:tcPr>
+            <w:tcW w:type="dxa" w:w="2880"/>
+            <w:vAlign w:val="top"/>
+            <w:tcMar>
+              <w:top w:w="40" w:type="dxa"/>
+              <w:left w:w="40" w:type="dxa"/>
+              <w:bottom w:w="40" w:type="dxa"/>
+              <w:right w:w="40" w:type="dxa"/>
+            </w:tcMar>
+          </w:tcPr>
+          <w:p>
+            <w:pPr>
+              <w:spacing w:after="0"/>
+            </w:pPr>
+            <w:r/>
+            <w:r>
+              <w:rPr>
+                <w:b/>
+                <w:sz w:val="14"/>
+              </w:rPr>
+              <w:t>Result</w:t>
+            </w:r>
+          </w:p>
+        </w:tc>
+        <w:tc>
+          <w:tcPr>
+            <w:tcW w:type="dxa" w:w="576"/>
+            <w:vAlign w:val="top"/>
+            <w:tcMar>
+              <w:top w:w="40" w:type="dxa"/>
+              <w:left w:w="40" w:type="dxa"/>
+              <w:bottom w:w="40" w:type="dxa"/>
+              <w:right w:w="40" w:type="dxa"/>
+            </w:tcMar>
+          </w:tcPr>
+          <w:p>
+            <w:pPr>
+              <w:spacing w:after="0"/>
+            </w:pPr>
+            <w:r/>
+            <w:r>
+              <w:rPr>
+                <w:b/>
+                <w:sz w:val="14"/>
+              </w:rPr>
+              <w:t>n</w:t>
+            </w:r>
+          </w:p>
+        </w:tc>
+        <w:tc>
+          <w:tcPr>
+            <w:tcW w:type="dxa" w:w="1008"/>
+            <w:vAlign w:val="top"/>
+            <w:tcMar>
+              <w:top w:w="40" w:type="dxa"/>
+              <w:left w:w="40" w:type="dxa"/>
+              <w:bottom w:w="40" w:type="dxa"/>
+              <w:right w:w="40" w:type="dxa"/>
+            </w:tcMar>
+          </w:tcPr>
+          <w:p>
+            <w:pPr>
+              <w:spacing w:after="0"/>
+            </w:pPr>
+            <w:r/>
+            <w:r>
+              <w:rPr>
+                <w:b/>
+                <w:sz w:val="14"/>
+              </w:rPr>
+              <w:t>Mean</w:t>
+            </w:r>
+          </w:p>
+        </w:tc>
+        <w:tc>
+          <w:tcPr>
+            <w:tcW w:type="dxa" w:w="1440"/>
+            <w:vAlign w:val="top"/>
+            <w:tcMar>
+              <w:top w:w="40" w:type="dxa"/>
+              <w:left w:w="40" w:type="dxa"/>
+              <w:bottom w:w="40" w:type="dxa"/>
+              <w:right w:w="40" w:type="dxa"/>
+            </w:tcMar>
+          </w:tcPr>
+          <w:p>
+            <w:pPr>
+              <w:spacing w:after="0"/>
+            </w:pPr>
+            <w:r/>
+            <w:r>
+              <w:rPr>
+                <w:b/>
+                <w:sz w:val="14"/>
+              </w:rPr>
+              <w:t>95% CI</w:t>
+            </w:r>
+          </w:p>
+        </w:tc>
+        <w:tc>
+          <w:tcPr>
+            <w:tcW w:type="dxa" w:w="2448"/>
+            <w:vAlign w:val="top"/>
+            <w:tcMar>
+              <w:top w:w="40" w:type="dxa"/>
+              <w:left w:w="40" w:type="dxa"/>
+              <w:bottom w:w="40" w:type="dxa"/>
+              <w:right w:w="40" w:type="dxa"/>
+            </w:tcMar>
+          </w:tcPr>
+          <w:p>
+            <w:pPr>
+              <w:spacing w:after="0"/>
+            </w:pPr>
+            <w:r/>
+            <w:r>
+              <w:rPr>
+                <w:b/>
+                <w:sz w:val="14"/>
+              </w:rPr>
+              <w:t>Source</w:t>
+            </w:r>
+          </w:p>
+        </w:tc>
+      </w:tr>
+      <w:tr>
+        <w:tc>
+          <w:tcPr>
+            <w:tcW w:type="dxa" w:w="2880"/>
+            <w:vAlign w:val="top"/>
+            <w:tcMar>
+              <w:top w:w="40" w:type="dxa"/>
+              <w:left w:w="40" w:type="dxa"/>
+              <w:bottom w:w="40" w:type="dxa"/>
+              <w:right w:w="40" w:type="dxa"/>
+            </w:tcMar>
+          </w:tcPr>
+          <w:p>
+            <w:pPr>
+              <w:spacing w:after="0"/>
+            </w:pPr>
+            <w:r/>
+            <w:r>
+              <w:rPr>
+                <w:b w:val="0"/>
+                <w:sz w:val="14"/>
+              </w:rPr>
+              <w:t>Demo constrained completion ratio</w:t>
+            </w:r>
+          </w:p>
+        </w:tc>
+        <w:tc>
+          <w:tcPr>
+            <w:tcW w:type="dxa" w:w="576"/>
+            <w:vAlign w:val="top"/>
+            <w:tcMar>
+              <w:top w:w="40" w:type="dxa"/>
+              <w:left w:w="40" w:type="dxa"/>
+              <w:bottom w:w="40" w:type="dxa"/>
+              <w:right w:w="40" w:type="dxa"/>
+            </w:tcMar>
+          </w:tcPr>
+          <w:p>
+            <w:pPr>
+              <w:spacing w:after="0"/>
+            </w:pPr>
+            <w:r/>
+            <w:r>
+              <w:rPr>
+                <w:b w:val="0"/>
+                <w:sz w:val="14"/>
+              </w:rPr>
+              <w:t>5</w:t>
+            </w:r>
+          </w:p>
+        </w:tc>
+        <w:tc>
+          <w:tcPr>
+            <w:tcW w:type="dxa" w:w="1008"/>
+            <w:vAlign w:val="top"/>
+            <w:tcMar>
+              <w:top w:w="40" w:type="dxa"/>
+              <w:left w:w="40" w:type="dxa"/>
+              <w:bottom w:w="40" w:type="dxa"/>
+              <w:right w:w="40" w:type="dxa"/>
+            </w:tcMar>
+          </w:tcPr>
+          <w:p>
+            <w:pPr>
+              <w:spacing w:after="0"/>
+            </w:pPr>
+            <w:r/>
+            <w:r>
+              <w:rPr>
+                <w:b w:val="0"/>
+                <w:sz w:val="14"/>
+              </w:rPr>
+              <w:t>0.656</w:t>
+            </w:r>
+          </w:p>
+        </w:tc>
+        <w:tc>
+          <w:tcPr>
+            <w:tcW w:type="dxa" w:w="1440"/>
+            <w:vAlign w:val="top"/>
+            <w:tcMar>
+              <w:top w:w="40" w:type="dxa"/>
+              <w:left w:w="40" w:type="dxa"/>
+              <w:bottom w:w="40" w:type="dxa"/>
+              <w:right w:w="40" w:type="dxa"/>
+            </w:tcMar>
+          </w:tcPr>
+          <w:p>
+            <w:pPr>
+              <w:spacing w:after="0"/>
+            </w:pPr>
+            <w:r/>
+            <w:r>
+              <w:rPr>
+                <w:b w:val="0"/>
+                <w:sz w:val="14"/>
+              </w:rPr>
+              <w:t>[0.628, 0.693]</w:t>
+            </w:r>
+          </w:p>
+        </w:tc>
+        <w:tc>
+          <w:tcPr>
+            <w:tcW w:type="dxa" w:w="2448"/>
+            <w:vAlign w:val="top"/>
+            <w:tcMar>
+              <w:top w:w="40" w:type="dxa"/>
+              <w:left w:w="40" w:type="dxa"/>
+              <w:bottom w:w="40" w:type="dxa"/>
+              <w:right w:w="40" w:type="dxa"/>
+            </w:tcMar>
+          </w:tcPr>
+          <w:p>
+            <w:pPr>
+              <w:spacing w:after="0"/>
+            </w:pPr>
+            <w:r/>
+            <w:r>
+              <w:rPr>
+                <w:b w:val="0"/>
+                <w:sz w:val="14"/>
+              </w:rPr>
+              <w:t>quic_emulated_path</w:t>
+            </w:r>
+          </w:p>
+        </w:tc>
+      </w:tr>
+      <w:tr>
+        <w:tc>
+          <w:tcPr>
+            <w:tcW w:type="dxa" w:w="2880"/>
+            <w:vAlign w:val="top"/>
+            <w:tcMar>
+              <w:top w:w="40" w:type="dxa"/>
+              <w:left w:w="40" w:type="dxa"/>
+              <w:bottom w:w="40" w:type="dxa"/>
+              <w:right w:w="40" w:type="dxa"/>
+            </w:tcMar>
+          </w:tcPr>
+          <w:p>
+            <w:pPr>
+              <w:spacing w:after="0"/>
+            </w:pPr>
+            <w:r/>
+            <w:r>
+              <w:rPr>
+                <w:b w:val="0"/>
+                <w:sz w:val="14"/>
+              </w:rPr>
+              <w:t>Demo encoded-byte ratio</w:t>
+            </w:r>
+          </w:p>
+        </w:tc>
+        <w:tc>
+          <w:tcPr>
+            <w:tcW w:type="dxa" w:w="576"/>
+            <w:vAlign w:val="top"/>
+            <w:tcMar>
+              <w:top w:w="40" w:type="dxa"/>
+              <w:left w:w="40" w:type="dxa"/>
+              <w:bottom w:w="40" w:type="dxa"/>
+              <w:right w:w="40" w:type="dxa"/>
+            </w:tcMar>
+          </w:tcPr>
+          <w:p>
+            <w:pPr>
+              <w:spacing w:after="0"/>
+            </w:pPr>
+            <w:r/>
+            <w:r>
+              <w:rPr>
+                <w:b w:val="0"/>
+                <w:sz w:val="14"/>
+              </w:rPr>
+              <w:t>5</w:t>
+            </w:r>
+          </w:p>
+        </w:tc>
+        <w:tc>
+          <w:tcPr>
+            <w:tcW w:type="dxa" w:w="1008"/>
+            <w:vAlign w:val="top"/>
+            <w:tcMar>
+              <w:top w:w="40" w:type="dxa"/>
+              <w:left w:w="40" w:type="dxa"/>
+              <w:bottom w:w="40" w:type="dxa"/>
+              <w:right w:w="40" w:type="dxa"/>
+            </w:tcMar>
+          </w:tcPr>
+          <w:p>
+            <w:pPr>
+              <w:spacing w:after="0"/>
+            </w:pPr>
+            <w:r/>
+            <w:r>
+              <w:rPr>
+                <w:b w:val="0"/>
+                <w:sz w:val="14"/>
+              </w:rPr>
+              <w:t>0.313</w:t>
+            </w:r>
+          </w:p>
+        </w:tc>
+        <w:tc>
+          <w:tcPr>
+            <w:tcW w:type="dxa" w:w="1440"/>
+            <w:vAlign w:val="top"/>
+            <w:tcMar>
+              <w:top w:w="40" w:type="dxa"/>
+              <w:left w:w="40" w:type="dxa"/>
+              <w:bottom w:w="40" w:type="dxa"/>
+              <w:right w:w="40" w:type="dxa"/>
+            </w:tcMar>
+          </w:tcPr>
+          <w:p>
+            <w:pPr>
+              <w:spacing w:after="0"/>
+            </w:pPr>
+            <w:r/>
+            <w:r>
+              <w:rPr>
+                <w:b w:val="0"/>
+                <w:sz w:val="14"/>
+              </w:rPr>
+              <w:t>[0.313, 0.313]</w:t>
+            </w:r>
+          </w:p>
+        </w:tc>
+        <w:tc>
+          <w:tcPr>
+            <w:tcW w:type="dxa" w:w="2448"/>
+            <w:vAlign w:val="top"/>
+            <w:tcMar>
+              <w:top w:w="40" w:type="dxa"/>
+              <w:left w:w="40" w:type="dxa"/>
+              <w:bottom w:w="40" w:type="dxa"/>
+              <w:right w:w="40" w:type="dxa"/>
+            </w:tcMar>
+          </w:tcPr>
+          <w:p>
+            <w:pPr>
+              <w:spacing w:after="0"/>
+            </w:pPr>
+            <w:r/>
+            <w:r>
+              <w:rPr>
+                <w:b w:val="0"/>
+                <w:sz w:val="14"/>
+              </w:rPr>
+              <w:t>quic_emulated_path</w:t>
+            </w:r>
+          </w:p>
+        </w:tc>
+      </w:tr>
+      <w:tr>
+        <w:tc>
+          <w:tcPr>
+            <w:tcW w:type="dxa" w:w="2880"/>
+            <w:vAlign w:val="top"/>
+            <w:tcMar>
+              <w:top w:w="40" w:type="dxa"/>
+              <w:left w:w="40" w:type="dxa"/>
+              <w:bottom w:w="40" w:type="dxa"/>
+              <w:right w:w="40" w:type="dxa"/>
+            </w:tcMar>
+          </w:tcPr>
+          <w:p>
+            <w:pPr>
+              <w:spacing w:after="0"/>
+            </w:pPr>
+            <w:r/>
+            <w:r>
+              <w:rPr>
+                <w:b w:val="0"/>
+                <w:sz w:val="14"/>
+              </w:rPr>
+              <w:t>Redis constrained completion ratio</w:t>
+            </w:r>
+          </w:p>
+        </w:tc>
+        <w:tc>
+          <w:tcPr>
+            <w:tcW w:type="dxa" w:w="576"/>
+            <w:vAlign w:val="top"/>
+            <w:tcMar>
+              <w:top w:w="40" w:type="dxa"/>
+              <w:left w:w="40" w:type="dxa"/>
+              <w:bottom w:w="40" w:type="dxa"/>
+              <w:right w:w="40" w:type="dxa"/>
+            </w:tcMar>
+          </w:tcPr>
+          <w:p>
+            <w:pPr>
+              <w:spacing w:after="0"/>
+            </w:pPr>
+            <w:r/>
+            <w:r>
+              <w:rPr>
+                <w:b w:val="0"/>
+                <w:sz w:val="14"/>
+              </w:rPr>
+              <w:t>3</w:t>
+            </w:r>
+          </w:p>
+        </w:tc>
+        <w:tc>
+          <w:tcPr>
+            <w:tcW w:type="dxa" w:w="1008"/>
+            <w:vAlign w:val="top"/>
+            <w:tcMar>
+              <w:top w:w="40" w:type="dxa"/>
+              <w:left w:w="40" w:type="dxa"/>
+              <w:bottom w:w="40" w:type="dxa"/>
+              <w:right w:w="40" w:type="dxa"/>
+            </w:tcMar>
+          </w:tcPr>
+          <w:p>
+            <w:pPr>
+              <w:spacing w:after="0"/>
+            </w:pPr>
+            <w:r/>
+            <w:r>
+              <w:rPr>
+                <w:b w:val="0"/>
+                <w:sz w:val="14"/>
+              </w:rPr>
+              <w:t>1.137</w:t>
+            </w:r>
+          </w:p>
+        </w:tc>
+        <w:tc>
+          <w:tcPr>
+            <w:tcW w:type="dxa" w:w="1440"/>
+            <w:vAlign w:val="top"/>
+            <w:tcMar>
+              <w:top w:w="40" w:type="dxa"/>
+              <w:left w:w="40" w:type="dxa"/>
+              <w:bottom w:w="40" w:type="dxa"/>
+              <w:right w:w="40" w:type="dxa"/>
+            </w:tcMar>
+          </w:tcPr>
+          <w:p>
+            <w:pPr>
+              <w:spacing w:after="0"/>
+            </w:pPr>
+            <w:r/>
+            <w:r>
+              <w:rPr>
+                <w:b w:val="0"/>
+                <w:sz w:val="14"/>
+              </w:rPr>
+              <w:t>[0.961, 1.416]</w:t>
+            </w:r>
+          </w:p>
+        </w:tc>
+        <w:tc>
+          <w:tcPr>
+            <w:tcW w:type="dxa" w:w="2448"/>
+            <w:vAlign w:val="top"/>
+            <w:tcMar>
+              <w:top w:w="40" w:type="dxa"/>
+              <w:left w:w="40" w:type="dxa"/>
+              <w:bottom w:w="40" w:type="dxa"/>
+              <w:right w:w="40" w:type="dxa"/>
+            </w:tcMar>
+          </w:tcPr>
+          <w:p>
+            <w:pPr>
+              <w:spacing w:after="0"/>
+            </w:pPr>
+            <w:r/>
+            <w:r>
+              <w:rPr>
+                <w:b w:val="0"/>
+                <w:sz w:val="14"/>
+              </w:rPr>
+              <w:t>quic_emulated_path_redis</w:t>
+            </w:r>
+          </w:p>
+        </w:tc>
+      </w:tr>
+      <w:tr>
+        <w:tc>
+          <w:tcPr>
+            <w:tcW w:type="dxa" w:w="2880"/>
+            <w:vAlign w:val="top"/>
+            <w:tcMar>
+              <w:top w:w="40" w:type="dxa"/>
+              <w:left w:w="40" w:type="dxa"/>
+              <w:bottom w:w="40" w:type="dxa"/>
+              <w:right w:w="40" w:type="dxa"/>
+            </w:tcMar>
+          </w:tcPr>
+          <w:p>
+            <w:pPr>
+              <w:spacing w:after="0"/>
+            </w:pPr>
+            <w:r/>
+            <w:r>
+              <w:rPr>
+                <w:b w:val="0"/>
+                <w:sz w:val="14"/>
+              </w:rPr>
+              <w:t>Redis encoded-byte ratio</w:t>
+            </w:r>
+          </w:p>
+        </w:tc>
+        <w:tc>
+          <w:tcPr>
+            <w:tcW w:type="dxa" w:w="576"/>
+            <w:vAlign w:val="top"/>
+            <w:tcMar>
+              <w:top w:w="40" w:type="dxa"/>
+              <w:left w:w="40" w:type="dxa"/>
+              <w:bottom w:w="40" w:type="dxa"/>
+              <w:right w:w="40" w:type="dxa"/>
+            </w:tcMar>
+          </w:tcPr>
+          <w:p>
+            <w:pPr>
+              <w:spacing w:after="0"/>
+            </w:pPr>
+            <w:r/>
+            <w:r>
+              <w:rPr>
+                <w:b w:val="0"/>
+                <w:sz w:val="14"/>
+              </w:rPr>
+              <w:t>3</w:t>
+            </w:r>
+          </w:p>
+        </w:tc>
+        <w:tc>
+          <w:tcPr>
+            <w:tcW w:type="dxa" w:w="1008"/>
+            <w:vAlign w:val="top"/>
+            <w:tcMar>
+              <w:top w:w="40" w:type="dxa"/>
+              <w:left w:w="40" w:type="dxa"/>
+              <w:bottom w:w="40" w:type="dxa"/>
+              <w:right w:w="40" w:type="dxa"/>
+            </w:tcMar>
+          </w:tcPr>
+          <w:p>
+            <w:pPr>
+              <w:spacing w:after="0"/>
+            </w:pPr>
+            <w:r/>
+            <w:r>
+              <w:rPr>
+                <w:b w:val="0"/>
+                <w:sz w:val="14"/>
+              </w:rPr>
+              <w:t>0.261</w:t>
+            </w:r>
+          </w:p>
+        </w:tc>
+        <w:tc>
+          <w:tcPr>
+            <w:tcW w:type="dxa" w:w="1440"/>
+            <w:vAlign w:val="top"/>
+            <w:tcMar>
+              <w:top w:w="40" w:type="dxa"/>
+              <w:left w:w="40" w:type="dxa"/>
+              <w:bottom w:w="40" w:type="dxa"/>
+              <w:right w:w="40" w:type="dxa"/>
+            </w:tcMar>
+          </w:tcPr>
+          <w:p>
+            <w:pPr>
+              <w:spacing w:after="0"/>
+            </w:pPr>
+            <w:r/>
+            <w:r>
+              <w:rPr>
+                <w:b w:val="0"/>
+                <w:sz w:val="14"/>
+              </w:rPr>
+              <w:t>[0.261, 0.261]</w:t>
+            </w:r>
+          </w:p>
+        </w:tc>
+        <w:tc>
+          <w:tcPr>
+            <w:tcW w:type="dxa" w:w="2448"/>
+            <w:vAlign w:val="top"/>
+            <w:tcMar>
+              <w:top w:w="40" w:type="dxa"/>
+              <w:left w:w="40" w:type="dxa"/>
+              <w:bottom w:w="40" w:type="dxa"/>
+              <w:right w:w="40" w:type="dxa"/>
+            </w:tcMar>
+          </w:tcPr>
+          <w:p>
+            <w:pPr>
+              <w:spacing w:after="0"/>
+            </w:pPr>
+            <w:r/>
+            <w:r>
+              <w:rPr>
+                <w:b w:val="0"/>
+                <w:sz w:val="14"/>
+              </w:rPr>
+              <w:t>quic_emulated_path_redis</w:t>
+            </w:r>
+          </w:p>
+        </w:tc>
+      </w:tr>
+      <w:tr>
+        <w:tc>
+          <w:tcPr>
+            <w:tcW w:type="dxa" w:w="2880"/>
+            <w:vAlign w:val="top"/>
+            <w:tcMar>
+              <w:top w:w="40" w:type="dxa"/>
+              <w:left w:w="40" w:type="dxa"/>
+              <w:bottom w:w="40" w:type="dxa"/>
+              <w:right w:w="40" w:type="dxa"/>
+            </w:tcMar>
+          </w:tcPr>
+          <w:p>
+            <w:pPr>
+              <w:spacing w:after="0"/>
+            </w:pPr>
+            <w:r/>
+            <w:r>
+              <w:rPr>
+                <w:b w:val="0"/>
+                <w:sz w:val="14"/>
+              </w:rPr>
+              <w:t>Concurrent localhost completion ratio</w:t>
+            </w:r>
+          </w:p>
+        </w:tc>
+        <w:tc>
+          <w:tcPr>
+            <w:tcW w:type="dxa" w:w="576"/>
+            <w:vAlign w:val="top"/>
+            <w:tcMar>
+              <w:top w:w="40" w:type="dxa"/>
+              <w:left w:w="40" w:type="dxa"/>
+              <w:bottom w:w="40" w:type="dxa"/>
+              <w:right w:w="40" w:type="dxa"/>
+            </w:tcMar>
+          </w:tcPr>
+          <w:p>
+            <w:pPr>
+              <w:spacing w:after="0"/>
+            </w:pPr>
+            <w:r/>
+            <w:r>
+              <w:rPr>
+                <w:b w:val="0"/>
+                <w:sz w:val="14"/>
+              </w:rPr>
+              <w:t>12</w:t>
+            </w:r>
+          </w:p>
+        </w:tc>
+        <w:tc>
+          <w:tcPr>
+            <w:tcW w:type="dxa" w:w="1008"/>
+            <w:vAlign w:val="top"/>
+            <w:tcMar>
+              <w:top w:w="40" w:type="dxa"/>
+              <w:left w:w="40" w:type="dxa"/>
+              <w:bottom w:w="40" w:type="dxa"/>
+              <w:right w:w="40" w:type="dxa"/>
+            </w:tcMar>
+          </w:tcPr>
+          <w:p>
+            <w:pPr>
+              <w:spacing w:after="0"/>
+            </w:pPr>
+            <w:r/>
+            <w:r>
+              <w:rPr>
+                <w:b w:val="0"/>
+                <w:sz w:val="14"/>
+              </w:rPr>
+              <w:t>1.083</w:t>
+            </w:r>
+          </w:p>
+        </w:tc>
+        <w:tc>
+          <w:tcPr>
+            <w:tcW w:type="dxa" w:w="1440"/>
+            <w:vAlign w:val="top"/>
+            <w:tcMar>
+              <w:top w:w="40" w:type="dxa"/>
+              <w:left w:w="40" w:type="dxa"/>
+              <w:bottom w:w="40" w:type="dxa"/>
+              <w:right w:w="40" w:type="dxa"/>
+            </w:tcMar>
+          </w:tcPr>
+          <w:p>
+            <w:pPr>
+              <w:spacing w:after="0"/>
+            </w:pPr>
+            <w:r/>
+            <w:r>
+              <w:rPr>
+                <w:b w:val="0"/>
+                <w:sz w:val="14"/>
+              </w:rPr>
+              <w:t>[0.966, 1.196]</w:t>
+            </w:r>
+          </w:p>
+        </w:tc>
+        <w:tc>
+          <w:tcPr>
+            <w:tcW w:type="dxa" w:w="2448"/>
+            <w:vAlign w:val="top"/>
+            <w:tcMar>
+              <w:top w:w="40" w:type="dxa"/>
+              <w:left w:w="40" w:type="dxa"/>
+              <w:bottom w:w="40" w:type="dxa"/>
+              <w:right w:w="40" w:type="dxa"/>
+            </w:tcMar>
+          </w:tcPr>
+          <w:p>
+            <w:pPr>
+              <w:spacing w:after="0"/>
+            </w:pPr>
+            <w:r/>
+            <w:r>
+              <w:rPr>
+                <w:b w:val="0"/>
+                <w:sz w:val="14"/>
+              </w:rPr>
+              <w:t>quic_competing_flows</w:t>
+            </w:r>
+          </w:p>
+        </w:tc>
+      </w:tr>
+      <w:tr>
+        <w:tc>
+          <w:tcPr>
+            <w:tcW w:type="dxa" w:w="2880"/>
+            <w:vAlign w:val="top"/>
+            <w:tcMar>
+              <w:top w:w="40" w:type="dxa"/>
+              <w:left w:w="40" w:type="dxa"/>
+              <w:bottom w:w="40" w:type="dxa"/>
+              <w:right w:w="40" w:type="dxa"/>
+            </w:tcMar>
+          </w:tcPr>
+          <w:p>
+            <w:pPr>
+              <w:spacing w:after="0"/>
+            </w:pPr>
+            <w:r/>
+            <w:r>
+              <w:rPr>
+                <w:b w:val="0"/>
+                <w:sz w:val="14"/>
+              </w:rPr>
+              <w:t>Concurrent localhost encoded-byte ratio</w:t>
+            </w:r>
+          </w:p>
+        </w:tc>
+        <w:tc>
+          <w:tcPr>
+            <w:tcW w:type="dxa" w:w="576"/>
+            <w:vAlign w:val="top"/>
+            <w:tcMar>
+              <w:top w:w="40" w:type="dxa"/>
+              <w:left w:w="40" w:type="dxa"/>
+              <w:bottom w:w="40" w:type="dxa"/>
+              <w:right w:w="40" w:type="dxa"/>
+            </w:tcMar>
+          </w:tcPr>
+          <w:p>
+            <w:pPr>
+              <w:spacing w:after="0"/>
+            </w:pPr>
+            <w:r/>
+            <w:r>
+              <w:rPr>
+                <w:b w:val="0"/>
+                <w:sz w:val="14"/>
+              </w:rPr>
+              <w:t>12</w:t>
+            </w:r>
+          </w:p>
+        </w:tc>
+        <w:tc>
+          <w:tcPr>
+            <w:tcW w:type="dxa" w:w="1008"/>
+            <w:vAlign w:val="top"/>
+            <w:tcMar>
+              <w:top w:w="40" w:type="dxa"/>
+              <w:left w:w="40" w:type="dxa"/>
+              <w:bottom w:w="40" w:type="dxa"/>
+              <w:right w:w="40" w:type="dxa"/>
+            </w:tcMar>
+          </w:tcPr>
+          <w:p>
+            <w:pPr>
+              <w:spacing w:after="0"/>
+            </w:pPr>
+            <w:r/>
+            <w:r>
+              <w:rPr>
+                <w:b w:val="0"/>
+                <w:sz w:val="14"/>
+              </w:rPr>
+              <w:t>0.313</w:t>
+            </w:r>
+          </w:p>
+        </w:tc>
+        <w:tc>
+          <w:tcPr>
+            <w:tcW w:type="dxa" w:w="1440"/>
+            <w:vAlign w:val="top"/>
+            <w:tcMar>
+              <w:top w:w="40" w:type="dxa"/>
+              <w:left w:w="40" w:type="dxa"/>
+              <w:bottom w:w="40" w:type="dxa"/>
+              <w:right w:w="40" w:type="dxa"/>
+            </w:tcMar>
+          </w:tcPr>
+          <w:p>
+            <w:pPr>
+              <w:spacing w:after="0"/>
+            </w:pPr>
+            <w:r/>
+            <w:r>
+              <w:rPr>
+                <w:b w:val="0"/>
+                <w:sz w:val="14"/>
+              </w:rPr>
+              <w:t>[0.313, 0.313]</w:t>
+            </w:r>
+          </w:p>
+        </w:tc>
+        <w:tc>
+          <w:tcPr>
+            <w:tcW w:type="dxa" w:w="2448"/>
+            <w:vAlign w:val="top"/>
+            <w:tcMar>
+              <w:top w:w="40" w:type="dxa"/>
+              <w:left w:w="40" w:type="dxa"/>
+              <w:bottom w:w="40" w:type="dxa"/>
+              <w:right w:w="40" w:type="dxa"/>
+            </w:tcMar>
+          </w:tcPr>
+          <w:p>
+            <w:pPr>
+              <w:spacing w:after="0"/>
+            </w:pPr>
+            <w:r/>
+            <w:r>
+              <w:rPr>
+                <w:b w:val="0"/>
+                <w:sz w:val="14"/>
+              </w:rPr>
+              <w:t>quic_competing_flows</w:t>
+            </w:r>
+          </w:p>
+        </w:tc>
+      </w:tr>
+      <w:tr>
+        <w:tc>
+          <w:tcPr>
+            <w:tcW w:type="dxa" w:w="2880"/>
+            <w:vAlign w:val="top"/>
+            <w:tcMar>
+              <w:top w:w="40" w:type="dxa"/>
+              <w:left w:w="40" w:type="dxa"/>
+              <w:bottom w:w="40" w:type="dxa"/>
+              <w:right w:w="40" w:type="dxa"/>
+            </w:tcMar>
+          </w:tcPr>
+          <w:p>
+            <w:pPr>
+              <w:spacing w:after="0"/>
+            </w:pPr>
+            <w:r/>
+            <w:r>
+              <w:rPr>
+                <w:b w:val="0"/>
+                <w:sz w:val="14"/>
+              </w:rPr>
+              <w:t>Sequential UDP-estimated multiplier</w:t>
+            </w:r>
+          </w:p>
+        </w:tc>
+        <w:tc>
+          <w:tcPr>
+            <w:tcW w:type="dxa" w:w="576"/>
+            <w:vAlign w:val="top"/>
+            <w:tcMar>
+              <w:top w:w="40" w:type="dxa"/>
+              <w:left w:w="40" w:type="dxa"/>
+              <w:bottom w:w="40" w:type="dxa"/>
+              <w:right w:w="40" w:type="dxa"/>
+            </w:tcMar>
+          </w:tcPr>
+          <w:p>
+            <w:pPr>
+              <w:spacing w:after="0"/>
+            </w:pPr>
+            <w:r/>
+            <w:r>
+              <w:rPr>
+                <w:b w:val="0"/>
+                <w:sz w:val="14"/>
+              </w:rPr>
+              <w:t>3</w:t>
+            </w:r>
+          </w:p>
+        </w:tc>
+        <w:tc>
+          <w:tcPr>
+            <w:tcW w:type="dxa" w:w="1008"/>
+            <w:vAlign w:val="top"/>
+            <w:tcMar>
+              <w:top w:w="40" w:type="dxa"/>
+              <w:left w:w="40" w:type="dxa"/>
+              <w:bottom w:w="40" w:type="dxa"/>
+              <w:right w:w="40" w:type="dxa"/>
+            </w:tcMar>
+          </w:tcPr>
+          <w:p>
+            <w:pPr>
+              <w:spacing w:after="0"/>
+            </w:pPr>
+            <w:r/>
+            <w:r>
+              <w:rPr>
+                <w:b w:val="0"/>
+                <w:sz w:val="14"/>
+              </w:rPr>
+              <w:t>2.579</w:t>
+            </w:r>
+          </w:p>
+        </w:tc>
+        <w:tc>
+          <w:tcPr>
+            <w:tcW w:type="dxa" w:w="1440"/>
+            <w:vAlign w:val="top"/>
+            <w:tcMar>
+              <w:top w:w="40" w:type="dxa"/>
+              <w:left w:w="40" w:type="dxa"/>
+              <w:bottom w:w="40" w:type="dxa"/>
+              <w:right w:w="40" w:type="dxa"/>
+            </w:tcMar>
+          </w:tcPr>
+          <w:p>
+            <w:pPr>
+              <w:spacing w:after="0"/>
+            </w:pPr>
+            <w:r/>
+            <w:r>
+              <w:rPr>
+                <w:b w:val="0"/>
+                <w:sz w:val="14"/>
+              </w:rPr>
+              <w:t>[2.575, 2.583]</w:t>
+            </w:r>
+          </w:p>
+        </w:tc>
+        <w:tc>
+          <w:tcPr>
+            <w:tcW w:type="dxa" w:w="2448"/>
+            <w:vAlign w:val="top"/>
+            <w:tcMar>
+              <w:top w:w="40" w:type="dxa"/>
+              <w:left w:w="40" w:type="dxa"/>
+              <w:bottom w:w="40" w:type="dxa"/>
+              <w:right w:w="40" w:type="dxa"/>
+            </w:tcMar>
+          </w:tcPr>
+          <w:p>
+            <w:pPr>
+              <w:spacing w:after="0"/>
+            </w:pPr>
+            <w:r/>
+            <w:r>
+              <w:rPr>
+                <w:b w:val="0"/>
+                <w:sz w:val="14"/>
+              </w:rPr>
+              <w:t>repeated_quic_trials</w:t>
+            </w:r>
+          </w:p>
+        </w:tc>
+      </w:tr>
+    </w:tbl>
+    <w:p/>
+    <w:p>
+      <w:pPr>
+        <w:spacing w:after="40" w:before="120"/>
+      </w:pPr>
+      <w:r>
+        <w:rPr>
+          <w:b/>
+          <w:sz w:val="18"/>
+        </w:rPr>
+        <w:t>Table 23. Analytic fluid-model completion times and implied application rates from measured encoded stream bytes (raw versus ReduLink); computed, not measured.</w:t>
       </w:r>
     </w:p>
     <w:tbl>
@@ -19129,7 +20189,7 @@
         <w:rPr>
           <w:sz w:val="20"/>
         </w:rPr>
-        <w:t>Beyond the in-stream experiments, three prototypes exercise the fail-closed and authentication paths directly. Table 23 summarizes them. The semantic-repair demo forces a 25 percent dictionary-miss fraction and confirms that every miss is repaired with a FULL and that reconstruction is byte-exact. The localhost UDP repair experiment drops every seventh data datagram and uses timeout-based retransmission, again reconstructing fully after 15 semantic repairs and 6 retransmissions. The authenticated UDP experiment adds explicit negative probes: a tampered authentication tag and a replayed nonce are both rejected (1 tamper and 1 replay rejection) before normal authenticated repair traffic is accepted, demonstrating fail-closed behavior under active manipulation.</w:t>
+        <w:t>Beyond the in-stream experiments, three prototypes exercise the fail-closed and authentication paths directly. Table 24 summarizes them. The semantic-repair demo forces a 25 percent dictionary-miss fraction and confirms that every miss is repaired with a FULL and that reconstruction is byte-exact. The localhost UDP repair experiment drops every seventh data datagram and uses timeout-based retransmission, again reconstructing fully after 15 semantic repairs and 6 retransmissions. The authenticated UDP experiment adds explicit negative probes: a tampered authentication tag and a replayed nonce are both rejected (1 tamper and 1 replay rejection) before normal authenticated repair traffic is accepted, demonstrating fail-closed behavior under active manipulation.</w:t>
       </w:r>
     </w:p>
     <w:p>
@@ -19141,7 +20201,7 @@
           <w:b/>
           <w:sz w:val="18"/>
         </w:rPr>
-        <w:t>Table 23. Repair and authentication prototypes (localhost).</w:t>
+        <w:t>Table 24. Repair and authentication prototypes (localhost).</w:t>
       </w:r>
     </w:p>
     <w:tbl>
@@ -19709,7 +20769,7 @@
         <w:rPr>
           <w:sz w:val="20"/>
         </w:rPr>
-        <w:t>Table 24 consolidates the positioning. ReduLink is the only approach in the comparison that combines operation over an end-to-end encrypted QUIC stream with per-reference authentication and an explicit fail-closed repair path; the other approaches each win in their own regime, which is exactly why ReduLink is presented as a complementary representation layer rather than a replacement.</w:t>
+        <w:t>Table 25 consolidates the positioning. ReduLink is the only approach in the comparison that combines operation over an end-to-end encrypted QUIC stream with per-reference authentication and an explicit fail-closed repair path; the other approaches each win in their own regime, which is exactly why ReduLink is presented as a complementary representation layer rather than a replacement.</w:t>
       </w:r>
     </w:p>
     <w:p>
@@ -19721,7 +20781,7 @@
           <w:b/>
           <w:sz w:val="18"/>
         </w:rPr>
-        <w:t>Table 24. Positioning of ReduLink relative to related redundancy-suppression approaches.</w:t>
+        <w:t>Table 25. Positioning of ReduLink relative to related redundancy-suppression approaches.</w:t>
       </w:r>
     </w:p>
     <w:tbl>
@@ -20824,7 +21884,7 @@
         <w:rPr>
           <w:sz w:val="20"/>
         </w:rPr>
-        <w:t>The implementation maps ReduLink into QUIC streams rather than adding custom QUIC extension frames or transport parameters, and it uses an exporter-style key schedule model rather than live QUIC TLS exporter bytes. The public object-sequence and layer-like workloads are derived from real release bytes but are transfer-model experiments rather than captured production traces. The fairness evidence is a measured twelve-round competing-flow experiment plus a measured full-duplex userspace path emulation across a rate/RTT grid on both byte-stable and real repair-heavy payloads (Section 10); userspace shaping is faithful at the studied rates but is not kernel tc/netem or Mininet, which requires a privileged host and remains future work, and all transport experiments run over localhost. The path-emulation history is a caution in itself: our first single-bucket shaper produced a completion-time finding that a correct full-duplex model reversed, so the completion-time results should be read as emulation-model-dependent until confirmed on a kernel emulator or real path. The miss-rate sweep is a one-path sensitivity check, not a full transport parameter study. Native-QUIC experiments now reach 16 MiB over a single localhost connection, including a demonstrated dictionary-budget overflow and recovery; multi-connection behavior, larger-than-memory dictionaries, and Internet-path dynamics remain out of scope. The independent positive version-pair study of Section 7.5 captures real package-distribution objects rather than a live production registry pull. The security analysis of Section 4.5 reduces reference unforgeability to standard HMAC and collision-resistance assumptions, but a machine-checked proof and production exporter-derived keying on every path remain future work. Headline byte multipliers are model-framed; the wire-priced values of Section 7.6 are 5 to 28 percent lower, and whole-stream dictionary delta beats both wherever its retention and trust assumptions hold. Absolute timings are hardware-dependent.</w:t>
+        <w:t>The implementation maps ReduLink into QUIC streams rather than adding custom QUIC extension frames or transport parameters, and it uses an exporter-style key schedule model rather than live QUIC TLS exporter bytes. The public object-sequence and layer-like workloads are derived from real release bytes but are transfer-model experiments rather than captured production traces. The fairness evidence is a measured twelve-round competing-flow experiment plus a measured full-duplex userspace path emulation across a rate/RTT grid on both byte-stable and real repair-heavy payloads (Section 10); userspace shaping is faithful at the studied rates but is not kernel tc/netem or Mininet, which requires a privileged host and remains future work, and all transport experiments run over localhost. We added a macOS pf/dnctl dummynet harness and verified its dry-run rules, but we do not report it as a completed aioquic sweep because raw aioquic handshakes timed out intermittently under loopback dummynet on this Mac. The path-emulation history is a caution in itself: our first single-bucket shaper produced a completion-time finding that a correct full-duplex model reversed, so the completion-time results should be read as emulation-model-dependent until confirmed on a kernel emulator or real path. The miss-rate sweep is a one-path sensitivity check, not a full transport parameter study. Native-QUIC experiments now reach 16 MiB over a single localhost connection, including a demonstrated dictionary-budget overflow and recovery; multi-connection behavior, larger-than-memory dictionaries, and Internet-path dynamics remain out of scope. The independent positive version-pair study of Section 7.5 captures real package-distribution objects rather than a live production registry pull. The security analysis of Section 4.5 reduces reference unforgeability to standard HMAC and collision-resistance assumptions, but a machine-checked proof and production exporter-derived keying on every path remain future work. Headline byte multipliers are model-framed; the wire-priced values of Section 7.6 are 5 to 28 percent lower, and whole-stream dictionary delta beats both wherever its retention and trust assumptions hold. Absolute timings are hardware-dependent.</w:t>
       </w:r>
     </w:p>
     <w:p>
@@ -20835,7 +21895,7 @@
         <w:rPr>
           <w:sz w:val="20"/>
         </w:rPr>
-        <w:t>Future work should add custom QUIC frame integration and transport-parameter negotiation, live exporter-derived keys, production replay-window and cross-tenant isolation enforcement, a privileged-host tc/netem or Mininet fairness study with competing real flows, packet capture, larger and live-captured registry or backup traces, a broader miss-rate grid across bandwidth and RTT, a machine-checked security proof, and a direct head-to-head comparison against Compression Dictionary Transport on the same corpora.</w:t>
+        <w:t>Future work should add custom QUIC frame integration and transport-parameter negotiation, live exporter-derived keys, production replay-window and cross-tenant isolation enforcement, a privileged-host tc/netem or Mininet fairness study with competing real flows, packet capture, larger and live-captured registry or backup traces, a broader miss-rate grid across bandwidth and RTT, a kernel-path rerun of the new dummynet harness on a platform where QUIC handshakes are stable under shaping, a machine-checked security proof, and a direct head-to-head comparison against Compression Dictionary Transport on the same corpora.</w:t>
       </w:r>
     </w:p>
     <w:p>
@@ -20857,7 +21917,7 @@
         <w:rPr>
           <w:sz w:val="20"/>
         </w:rPr>
-        <w:t>The package contains source code, public corpora, generated corpora, benchmark scripts, result CSV/JSON files, figures, a citation checker, and tests [15]. The reviewer-facing smoke command is python3 scripts/run_smoke_validation.py and full validation is python3 scripts/run_full_validation.py. aioquic tests skip gracefully when aioquic is unavailable; installing requirements-dev.txt enables complete QUIC stream validation. Every table and figure in this paper is regenerated from the committed result files by scripts/build_manuscript_v3_8.py and scripts/make_journal_figures_v2_8.py. The framing-repricing and dictionary-delta baseline is regenerated by benchmarks/run_framing_dictionary_baseline.py, the miss-rate sensitivity sweep by benchmarks/run_quic_miss_rate_sensitivity.py, and the verifier-hardening properties of Section 4.5 (authentication-first ordering, bounded replay window, context binding under a valid tag) are pinned by dedicated unit tests. Each version of this manuscript is accompanied by an annotated git tag and a GitHub release whose assets include the final PDF and DOCX; the SHA-256 hashes of both files are pinned in MANUSCRIPT_SHA256.txt in the tagged tree, so reviewers can verify that the reviewed PDF matches the archived artifact.</w:t>
+        <w:t>The package contains source code, public corpora, generated corpora, benchmark scripts, result CSV/JSON files, figures, a citation checker, and tests [15]. The reviewer-facing smoke command is python3 scripts/run_smoke_validation.py and full validation is python3 scripts/run_full_validation.py. aioquic tests skip gracefully when aioquic is unavailable; installing requirements-dev.txt enables complete QUIC stream validation. Every table and figure in this paper is regenerated from the committed result files by scripts/build_manuscript_v3_8.py and scripts/make_journal_figures_v2_8.py. The framing-repricing and dictionary-delta baseline is regenerated by benchmarks/run_framing_dictionary_baseline.py, the miss-rate sensitivity sweep by benchmarks/run_quic_miss_rate_sensitivity.py, the QUIC confidence-interval table by benchmarks/summarize_quic_statistical_evidence.py, and the verifier-hardening properties of Section 4.5 (authentication-first ordering, bounded replay window, context binding under a valid tag) are pinned by dedicated unit tests. Each version of this manuscript is accompanied by an annotated git tag and a GitHub release whose assets include the final PDF and DOCX; the SHA-256 hashes of both files are pinned in MANUSCRIPT_SHA256.txt in the tagged tree, so reviewers can verify that the reviewed PDF matches the archived artifact.</w:t>
       </w:r>
     </w:p>
     <w:p>

</xml_diff>